<commit_message>
level4+new things for slime and crystal
</commit_message>
<xml_diff>
--- a/Doc/KVDDokumentacija_GodotSpele_Sidorcenko.docx
+++ b/Doc/KVDDokumentacija_GodotSpele_Sidorcenko.docx
@@ -36821,7 +36821,7 @@
         </w:r>
         <w:r>
           <w:rPr/>
-          <w:t>52</w:t>
+          <w:t>56</w:t>
         </w:r>
         <w:r>
           <w:rPr/>
@@ -36873,7 +36873,7 @@
         </w:r>
         <w:r>
           <w:rPr/>
-          <w:t>52</w:t>
+          <w:t>56</w:t>
         </w:r>
         <w:r>
           <w:rPr/>

</xml_diff>